<commit_message>
Consolidate FrameMind UI, plans, and evidence updates
</commit_message>
<xml_diff>
--- a/docs/evidence/T28-baseline.docx
+++ b/docs/evidence/T28-baseline.docx
@@ -33,7 +33,7 @@
         <w:spacing w:after="130"/>
       </w:pPr>
       <w:r>
-        <w:t xml:space="preserve">项目 悬臂杆工程计算书基线；项目 ID project_e98658b0-4d19-44b5-b73a-29c2c00f4a55</w:t>
+        <w:t xml:space="preserve">项目 悬臂杆工程计算书基线；项目 ID project_ecebecca-2235-4d9b-886b-9bee213a9d4a</w:t>
       </w:r>
     </w:p>
     <w:p>
@@ -41,7 +41,7 @@
         <w:spacing w:after="130"/>
       </w:pPr>
       <w:r>
-        <w:t xml:space="preserve">分析 ID analysis_139081dd-c069-437d-a56b-60d59cbd9dc8；输入修订 R7；状态 已完成</w:t>
+        <w:t xml:space="preserve">分析 ID analysis_0fab8ebf-f766-4971-a3d3-8744794cf200；输入修订 R7；状态 已完成</w:t>
       </w:r>
     </w:p>
     <w:p>
@@ -49,7 +49,7 @@
         <w:spacing w:after="130"/>
       </w:pPr>
       <w:r>
-        <w:t xml:space="preserve">分析时间 2026-10-02T13:20:53.008Z；报告生成时间 2026-10-02T13:20:55.311Z（ISO 8601）</w:t>
+        <w:t xml:space="preserve">分析时间 2026-10-03T05:51:51.919Z；报告生成时间 2026-10-03T05:51:54.436Z（ISO 8601）</w:t>
       </w:r>
     </w:p>
     <w:p>

</xml_diff>

<commit_message>
chore: snapshot current FrameMind project for GitHub
</commit_message>
<xml_diff>
--- a/docs/evidence/T28-baseline.docx
+++ b/docs/evidence/T28-baseline.docx
@@ -33,7 +33,7 @@
         <w:spacing w:after="130"/>
       </w:pPr>
       <w:r>
-        <w:t xml:space="preserve">项目 悬臂杆工程计算书基线；项目 ID project_ecebecca-2235-4d9b-886b-9bee213a9d4a</w:t>
+        <w:t xml:space="preserve">项目 悬臂杆工程计算书基线；项目 ID project_483fbd2f-3736-4f8e-9118-e8e5f6f0eb94</w:t>
       </w:r>
     </w:p>
     <w:p>
@@ -41,7 +41,7 @@
         <w:spacing w:after="130"/>
       </w:pPr>
       <w:r>
-        <w:t xml:space="preserve">分析 ID analysis_0fab8ebf-f766-4971-a3d3-8744794cf200；输入修订 R7；状态 已完成</w:t>
+        <w:t xml:space="preserve">分析 ID analysis_e27992b5-5a90-4380-9299-68a9bacd0ca3；输入修订 R7；状态 已完成</w:t>
       </w:r>
     </w:p>
     <w:p>
@@ -49,7 +49,15 @@
         <w:spacing w:after="130"/>
       </w:pPr>
       <w:r>
-        <w:t xml:space="preserve">分析时间 2026-10-03T05:51:51.919Z；报告生成时间 2026-10-03T05:51:54.436Z（ISO 8601）</w:t>
+        <w:t xml:space="preserve">分析时间 2026-10-05T07:07:48.915Z；报告生成时间 2026-10-05T07:07:51.684Z（ISO 8601）</w:t>
+      </w:r>
+    </w:p>
+    <w:p>
+      <w:pPr>
+        <w:spacing w:after="130"/>
+      </w:pPr>
+      <w:r>
+        <w:t xml:space="preserve">历史结果未保存服务运行阶段；不重建或推测原始阶段时间。</w:t>
       </w:r>
     </w:p>
     <w:p>

</xml_diff>